<commit_message>
Filled out task 1
</commit_message>
<xml_diff>
--- a/D339 Task 1.docx
+++ b/D339 Task 1.docx
@@ -159,7 +159,25 @@
           <w:sz w:val="28"/>
           <w:szCs w:val="28"/>
         </w:rPr>
-        <w:t>(this includes sections A1. Explanation and A2. Compelling Argument)</w:t>
+        <w:t xml:space="preserve">(this includes </w:t>
+      </w:r>
+      <w:proofErr w:type="gramStart"/>
+      <w:r>
+        <w:rPr>
+          <w:rFonts w:ascii="Arial" w:hAnsi="Arial" w:cs="Arial"/>
+          <w:sz w:val="28"/>
+          <w:szCs w:val="28"/>
+        </w:rPr>
+        <w:t>sections</w:t>
+      </w:r>
+      <w:proofErr w:type="gramEnd"/>
+      <w:r>
+        <w:rPr>
+          <w:rFonts w:ascii="Arial" w:hAnsi="Arial" w:cs="Arial"/>
+          <w:sz w:val="28"/>
+          <w:szCs w:val="28"/>
+        </w:rPr>
+        <w:t xml:space="preserve"> A1. Explanation and A2. Compelling Argument)</w:t>
       </w:r>
     </w:p>
     <w:p>
@@ -457,19 +475,19 @@
     </w:p>
     <w:p>
       <w:pPr>
-        <w:ind w:firstLine="720"/>
-        <w:rPr>
-          <w:rFonts w:ascii="Arial" w:hAnsi="Arial" w:cs="Arial"/>
-          <w:sz w:val="28"/>
-          <w:szCs w:val="28"/>
-        </w:rPr>
-      </w:pPr>
-      <w:r>
-        <w:rPr>
-          <w:rFonts w:ascii="Arial" w:hAnsi="Arial" w:cs="Arial"/>
-          <w:sz w:val="28"/>
-          <w:szCs w:val="28"/>
-        </w:rPr>
+        <w:rPr>
+          <w:rFonts w:ascii="Arial" w:hAnsi="Arial" w:cs="Arial"/>
+          <w:sz w:val="28"/>
+          <w:szCs w:val="28"/>
+        </w:rPr>
+      </w:pPr>
+      <w:r>
+        <w:rPr>
+          <w:rFonts w:ascii="Arial" w:hAnsi="Arial" w:cs="Arial"/>
+          <w:sz w:val="28"/>
+          <w:szCs w:val="28"/>
+        </w:rPr>
+        <w:tab/>
         <w:t xml:space="preserve">As an indie game studio, we are player-obsessed, and that means always striving to deliver the most engaging, high-quality experiences possible. </w:t>
       </w:r>
       <w:proofErr w:type="gramStart"/>
@@ -493,29 +511,28 @@
     </w:p>
     <w:p>
       <w:pPr>
-        <w:ind w:firstLine="720"/>
-        <w:rPr>
-          <w:rFonts w:ascii="Arial" w:hAnsi="Arial" w:cs="Arial"/>
-          <w:sz w:val="28"/>
-          <w:szCs w:val="28"/>
-        </w:rPr>
-      </w:pPr>
-    </w:p>
-    <w:p>
-      <w:pPr>
-        <w:ind w:firstLine="720"/>
-        <w:rPr>
-          <w:rFonts w:ascii="Arial" w:hAnsi="Arial" w:cs="Arial"/>
-          <w:sz w:val="28"/>
-          <w:szCs w:val="28"/>
-        </w:rPr>
-      </w:pPr>
-      <w:r>
-        <w:rPr>
-          <w:rFonts w:ascii="Arial" w:hAnsi="Arial" w:cs="Arial"/>
-          <w:sz w:val="28"/>
-          <w:szCs w:val="28"/>
-        </w:rPr>
+        <w:rPr>
+          <w:rFonts w:ascii="Arial" w:hAnsi="Arial" w:cs="Arial"/>
+          <w:sz w:val="28"/>
+          <w:szCs w:val="28"/>
+        </w:rPr>
+      </w:pPr>
+    </w:p>
+    <w:p>
+      <w:pPr>
+        <w:rPr>
+          <w:rFonts w:ascii="Arial" w:hAnsi="Arial" w:cs="Arial"/>
+          <w:sz w:val="28"/>
+          <w:szCs w:val="28"/>
+        </w:rPr>
+      </w:pPr>
+      <w:r>
+        <w:rPr>
+          <w:rFonts w:ascii="Arial" w:hAnsi="Arial" w:cs="Arial"/>
+          <w:sz w:val="28"/>
+          <w:szCs w:val="28"/>
+        </w:rPr>
+        <w:tab/>
         <w:t xml:space="preserve">Currently, our studio uses the Unity game engine and a C# programming environment to build our games. Moving to the future, using Unreal Engine will represent a major shift in the technology and processes we use. Under the hood, it utilizes C++ alongside a highly versatile visual scripting tool called Blueprints (Bogner, 2025). While learning a new workspace can be daunting, </w:t>
       </w:r>
       <w:proofErr w:type="spellStart"/>
@@ -534,7 +551,25 @@
           <w:sz w:val="28"/>
           <w:szCs w:val="28"/>
         </w:rPr>
-        <w:t xml:space="preserve"> toolset is designed to rapidly accelerate our workflow. Because it comes loaded with built-in 3D systems and out-of-the-box rendering tools, we save precious time and money that would otherwise be spent building foundational mechanics from scratch (</w:t>
+        <w:t xml:space="preserve"> toolset is designed to rapidly accelerate our workflow. Because it </w:t>
+      </w:r>
+      <w:proofErr w:type="gramStart"/>
+      <w:r>
+        <w:rPr>
+          <w:rFonts w:ascii="Arial" w:hAnsi="Arial" w:cs="Arial"/>
+          <w:sz w:val="28"/>
+          <w:szCs w:val="28"/>
+        </w:rPr>
+        <w:t>comes loaded</w:t>
+      </w:r>
+      <w:proofErr w:type="gramEnd"/>
+      <w:r>
+        <w:rPr>
+          <w:rFonts w:ascii="Arial" w:hAnsi="Arial" w:cs="Arial"/>
+          <w:sz w:val="28"/>
+          <w:szCs w:val="28"/>
+        </w:rPr>
+        <w:t xml:space="preserve"> with built-in 3D systems and out-of-the-box rendering tools, we save precious time and money that would otherwise be spent building foundational mechanics from scratch (</w:t>
       </w:r>
       <w:proofErr w:type="spellStart"/>
       <w:r>
@@ -543,7 +578,7 @@
           <w:sz w:val="28"/>
           <w:szCs w:val="28"/>
         </w:rPr>
-        <w:t>Kevuru</w:t>
+        <w:t>Mozolevska</w:t>
       </w:r>
       <w:proofErr w:type="spellEnd"/>
       <w:r>
@@ -552,34 +587,33 @@
           <w:sz w:val="28"/>
           <w:szCs w:val="28"/>
         </w:rPr>
-        <w:t xml:space="preserve"> Games, 2026). Ultimately, this engine is built for massive, hardware-intensive projects, putting industry-leading photorealism right at our fingertips.</w:t>
-      </w:r>
-    </w:p>
-    <w:p>
-      <w:pPr>
-        <w:ind w:firstLine="720"/>
-        <w:rPr>
-          <w:rFonts w:ascii="Arial" w:hAnsi="Arial" w:cs="Arial"/>
-          <w:sz w:val="28"/>
-          <w:szCs w:val="28"/>
-        </w:rPr>
-      </w:pPr>
-    </w:p>
-    <w:p>
-      <w:pPr>
-        <w:ind w:firstLine="720"/>
-        <w:rPr>
-          <w:rFonts w:ascii="Arial" w:hAnsi="Arial" w:cs="Arial"/>
-          <w:sz w:val="28"/>
-          <w:szCs w:val="28"/>
-        </w:rPr>
-      </w:pPr>
-      <w:r>
-        <w:rPr>
-          <w:rFonts w:ascii="Arial" w:hAnsi="Arial" w:cs="Arial"/>
-          <w:sz w:val="28"/>
-          <w:szCs w:val="28"/>
-        </w:rPr>
+        <w:t>, 2026). Ultimately, this engine is built for massive, hardware-intensive projects, putting industry-leading photorealism right at our fingertips.</w:t>
+      </w:r>
+    </w:p>
+    <w:p>
+      <w:pPr>
+        <w:rPr>
+          <w:rFonts w:ascii="Arial" w:hAnsi="Arial" w:cs="Arial"/>
+          <w:sz w:val="28"/>
+          <w:szCs w:val="28"/>
+        </w:rPr>
+      </w:pPr>
+    </w:p>
+    <w:p>
+      <w:pPr>
+        <w:rPr>
+          <w:rFonts w:ascii="Arial" w:hAnsi="Arial" w:cs="Arial"/>
+          <w:sz w:val="28"/>
+          <w:szCs w:val="28"/>
+        </w:rPr>
+      </w:pPr>
+      <w:r>
+        <w:rPr>
+          <w:rFonts w:ascii="Arial" w:hAnsi="Arial" w:cs="Arial"/>
+          <w:sz w:val="28"/>
+          <w:szCs w:val="28"/>
+        </w:rPr>
+        <w:tab/>
         <w:t xml:space="preserve">This leads to exactly why our studio should fully transition to Unreal Engine for our upcoming projects. Most importantly for our pipeline, </w:t>
       </w:r>
       <w:proofErr w:type="spellStart"/>
@@ -598,7 +632,7 @@
           <w:sz w:val="28"/>
           <w:szCs w:val="28"/>
         </w:rPr>
-        <w:t xml:space="preserve"> Blueprints visual scripting system bridges the gap between design and development, allowing our artists and designers to actively build and test gameplay logic through an intuitive node-based interface (Meshy AI, 2026). This shift eliminates major bottlenecks by empowering the design team to prototype immediately, freeing our programmers to tackle deeper architectural challenges. Just as this workflow empowers our mechanics, features like Nanite and Lumen empower our visuals—allowing us to hit photorealism right out of the box while skipping hours of manual optimization (Meshy AI, 2026). Ultimately, this technical leap is supported by a highly favorable business model for indie studios. Because Unreal Engine is completely free to use until a title generates $1 million in revenue, we gain access to an industry-leading engine with zero upfront software costs (</w:t>
+        <w:t xml:space="preserve"> Blueprints visual scripting system bridges the gap between design and development, allowing our artists and designers to actively build and test gameplay logic through an intuitive node-based interface (</w:t>
       </w:r>
       <w:proofErr w:type="spellStart"/>
       <w:r>
@@ -607,7 +641,7 @@
           <w:sz w:val="28"/>
           <w:szCs w:val="28"/>
         </w:rPr>
-        <w:t>Kevuru</w:t>
+        <w:t>Fonarov</w:t>
       </w:r>
       <w:proofErr w:type="spellEnd"/>
       <w:r>
@@ -616,22 +650,56 @@
           <w:sz w:val="28"/>
           <w:szCs w:val="28"/>
         </w:rPr>
-        <w:t xml:space="preserve"> Games, 2026).</w:t>
-      </w:r>
-    </w:p>
-    <w:p>
-      <w:pPr>
-        <w:ind w:firstLine="720"/>
-        <w:rPr>
-          <w:rFonts w:ascii="Arial" w:hAnsi="Arial" w:cs="Arial"/>
-          <w:sz w:val="28"/>
-          <w:szCs w:val="28"/>
-        </w:rPr>
-      </w:pPr>
-    </w:p>
-    <w:p>
-      <w:pPr>
-        <w:ind w:firstLine="720"/>
+        <w:t>, 2026). Beyond improving our daily workflow, built-in features like Nanite and Lumen will elevate our graphics, enabling us to achieve photorealism right out of the box while skipping hours of manual optimization (</w:t>
+      </w:r>
+      <w:proofErr w:type="spellStart"/>
+      <w:r>
+        <w:rPr>
+          <w:rFonts w:ascii="Arial" w:hAnsi="Arial" w:cs="Arial"/>
+          <w:sz w:val="28"/>
+          <w:szCs w:val="28"/>
+        </w:rPr>
+        <w:t>Fonarov</w:t>
+      </w:r>
+      <w:proofErr w:type="spellEnd"/>
+      <w:r>
+        <w:rPr>
+          <w:rFonts w:ascii="Arial" w:hAnsi="Arial" w:cs="Arial"/>
+          <w:sz w:val="28"/>
+          <w:szCs w:val="28"/>
+        </w:rPr>
+        <w:t>, 2026). In addition to these technical upgrades, this shift is backed by a highly favorable business model for indie studios. Unreal Engine is completely free to use until a title generates $1 million in revenue; we gain access to industry-leading development tools with zero upfront software costs (</w:t>
+      </w:r>
+      <w:proofErr w:type="spellStart"/>
+      <w:r>
+        <w:rPr>
+          <w:rFonts w:ascii="Arial" w:hAnsi="Arial" w:cs="Arial"/>
+          <w:sz w:val="28"/>
+          <w:szCs w:val="28"/>
+        </w:rPr>
+        <w:t>Mozolevska</w:t>
+      </w:r>
+      <w:proofErr w:type="spellEnd"/>
+      <w:r>
+        <w:rPr>
+          <w:rFonts w:ascii="Arial" w:hAnsi="Arial" w:cs="Arial"/>
+          <w:sz w:val="28"/>
+          <w:szCs w:val="28"/>
+        </w:rPr>
+        <w:t>, 2026).</w:t>
+      </w:r>
+    </w:p>
+    <w:p>
+      <w:pPr>
+        <w:rPr>
+          <w:rFonts w:ascii="Arial" w:hAnsi="Arial" w:cs="Arial"/>
+          <w:sz w:val="28"/>
+          <w:szCs w:val="28"/>
+        </w:rPr>
+      </w:pPr>
+    </w:p>
+    <w:p>
+      <w:pPr>
         <w:rPr>
           <w:rFonts w:ascii="Arial" w:hAnsi="Arial" w:cs="Arial"/>
           <w:b/>
@@ -646,32 +714,8 @@
           <w:sz w:val="28"/>
           <w:szCs w:val="28"/>
         </w:rPr>
-        <w:t xml:space="preserve">Hopefully, the explanation above helps to make it clear why using Unreal Engine will be more helpful for our development team. Unreal Engine provides advanced visual scripting, multiple layers of out-of-the-box rendering technology, and a highly accessible pricing model. For this reason, studio leadership and the development team should fully support </w:t>
-      </w:r>
-      <w:r>
-        <w:rPr>
-          <w:rFonts w:ascii="Arial" w:hAnsi="Arial" w:cs="Arial"/>
-          <w:sz w:val="28"/>
-          <w:szCs w:val="28"/>
-        </w:rPr>
-        <w:lastRenderedPageBreak/>
-        <w:t>the transition to Unreal Engine to ensure greater creative freedom and financial stability.</w:t>
-      </w:r>
-      <w:r>
-        <w:rPr>
-          <w:rFonts w:ascii="Arial" w:hAnsi="Arial" w:cs="Arial"/>
-          <w:sz w:val="28"/>
-          <w:szCs w:val="28"/>
-        </w:rPr>
-        <w:t xml:space="preserve"> </w:t>
-      </w:r>
-      <w:r>
-        <w:rPr>
-          <w:rFonts w:ascii="Arial" w:hAnsi="Arial" w:cs="Arial"/>
-          <w:sz w:val="28"/>
-          <w:szCs w:val="28"/>
-        </w:rPr>
-        <w:t>the transition to Unreal Engine to ensure greater creative freedom and financial stability.</w:t>
+        <w:tab/>
+        <w:t>Ultimately, transitioning to Unreal Engine equips our development team with the exact tools needed to work more efficiently and build better games. Unreal Engine provides advanced visual scripting, multiple layers of out-of-the-box rendering technology, and a highly accessible pricing model. For this reason, studio leadership and the development team should fully support the transition to Unreal Engine to ensure greater creative freedom and financial stability.</w:t>
       </w:r>
     </w:p>
     <w:p>
@@ -695,9 +739,7 @@
           <w:szCs w:val="28"/>
         </w:rPr>
       </w:pPr>
-    </w:p>
-    <w:p>
-      <w:pPr>
+      <w:r>
         <w:rPr>
           <w:rFonts w:ascii="Arial" w:hAnsi="Arial" w:cs="Arial"/>
           <w:b/>
@@ -705,8 +747,28 @@
           <w:sz w:val="28"/>
           <w:szCs w:val="28"/>
         </w:rPr>
-      </w:pPr>
-      <w:r>
+        <w:t>Section B: Identify Employee Group</w:t>
+      </w:r>
+    </w:p>
+    <w:p>
+      <w:pPr>
+        <w:rPr>
+          <w:rFonts w:ascii="Arial" w:hAnsi="Arial" w:cs="Arial"/>
+          <w:sz w:val="28"/>
+          <w:szCs w:val="28"/>
+        </w:rPr>
+      </w:pPr>
+      <w:r>
+        <w:rPr>
+          <w:rFonts w:ascii="Arial" w:hAnsi="Arial" w:cs="Arial"/>
+          <w:sz w:val="28"/>
+          <w:szCs w:val="28"/>
+        </w:rPr>
+        <w:t>The employee group being addressed in this blog post is the internal game development team at an independent game studio. This audience specifically consists of software engineers, 3D artists, and gameplay designers who currently utilize the Unity engine and will be directly responsible for executing the transition to Unreal Engine.</w:t>
+      </w:r>
+    </w:p>
+    <w:p>
+      <w:pPr>
         <w:rPr>
           <w:rFonts w:ascii="Arial" w:hAnsi="Arial" w:cs="Arial"/>
           <w:b/>
@@ -714,49 +776,7 @@
           <w:sz w:val="28"/>
           <w:szCs w:val="28"/>
         </w:rPr>
-        <w:t>Section B: Identify Employee Group</w:t>
-      </w:r>
-    </w:p>
-    <w:p>
-      <w:pPr>
-        <w:rPr>
-          <w:rFonts w:ascii="Arial" w:hAnsi="Arial" w:cs="Arial"/>
-          <w:sz w:val="28"/>
-          <w:szCs w:val="28"/>
-        </w:rPr>
-      </w:pPr>
-      <w:r>
-        <w:rPr>
-          <w:rFonts w:ascii="Arial" w:hAnsi="Arial" w:cs="Arial"/>
-          <w:sz w:val="28"/>
-          <w:szCs w:val="28"/>
-        </w:rPr>
-        <w:t>Please provide a sentence or two that describes who the people are in this employee group being used as your audience for the blog post.</w:t>
-      </w:r>
-      <w:r>
-        <w:rPr>
-          <w:rFonts w:ascii="Arial" w:hAnsi="Arial" w:cs="Arial"/>
-          <w:sz w:val="28"/>
-          <w:szCs w:val="28"/>
-        </w:rPr>
-        <w:t xml:space="preserve"> Make sure this group is appropriate for the assignment. It should not be customers</w:t>
-      </w:r>
-      <w:r>
-        <w:rPr>
-          <w:rFonts w:ascii="Arial" w:hAnsi="Arial" w:cs="Arial"/>
-          <w:sz w:val="28"/>
-          <w:szCs w:val="28"/>
-        </w:rPr>
-        <w:t>;</w:t>
-      </w:r>
-      <w:r>
-        <w:rPr>
-          <w:rFonts w:ascii="Arial" w:hAnsi="Arial" w:cs="Arial"/>
-          <w:sz w:val="28"/>
-          <w:szCs w:val="28"/>
-        </w:rPr>
-        <w:t xml:space="preserve"> it should be a group of employees within a company. </w:t>
-      </w:r>
+      </w:pPr>
     </w:p>
     <w:p>
       <w:pPr>
@@ -768,9 +788,7 @@
           <w:szCs w:val="28"/>
         </w:rPr>
       </w:pPr>
-    </w:p>
-    <w:p>
-      <w:pPr>
+      <w:r>
         <w:rPr>
           <w:rFonts w:ascii="Arial" w:hAnsi="Arial" w:cs="Arial"/>
           <w:b/>
@@ -778,8 +796,11 @@
           <w:sz w:val="28"/>
           <w:szCs w:val="28"/>
         </w:rPr>
-      </w:pPr>
-      <w:r>
+        <w:t xml:space="preserve">B1. Analyzing Business Etiquette </w:t>
+      </w:r>
+    </w:p>
+    <w:p>
+      <w:pPr>
         <w:rPr>
           <w:rFonts w:ascii="Arial" w:hAnsi="Arial" w:cs="Arial"/>
           <w:b/>
@@ -787,64 +808,32 @@
           <w:sz w:val="28"/>
           <w:szCs w:val="28"/>
         </w:rPr>
-        <w:t xml:space="preserve">B1. Analyzing Business Etiquette </w:t>
-      </w:r>
-    </w:p>
-    <w:p>
-      <w:pPr>
-        <w:rPr>
-          <w:rFonts w:ascii="Arial" w:hAnsi="Arial" w:cs="Arial"/>
-          <w:sz w:val="28"/>
-          <w:szCs w:val="28"/>
-        </w:rPr>
-      </w:pPr>
-      <w:r>
-        <w:rPr>
-          <w:rFonts w:ascii="Arial" w:hAnsi="Arial" w:cs="Arial"/>
-          <w:sz w:val="28"/>
-          <w:szCs w:val="28"/>
-        </w:rPr>
-        <w:t xml:space="preserve">Explain how the audience you described above influenced your choices in writing the blog post to keep with the expected etiquette for blog posts in the industry. </w:t>
-      </w:r>
-      <w:r>
-        <w:rPr>
-          <w:rFonts w:ascii="Arial" w:hAnsi="Arial" w:cs="Arial"/>
-          <w:sz w:val="28"/>
-          <w:szCs w:val="28"/>
-        </w:rPr>
-        <w:t xml:space="preserve">Include in this explanation an idea of what tone </w:t>
-      </w:r>
-      <w:r>
-        <w:rPr>
-          <w:rFonts w:ascii="Arial" w:hAnsi="Arial" w:cs="Arial"/>
-          <w:sz w:val="28"/>
-          <w:szCs w:val="28"/>
-        </w:rPr>
-        <w:t xml:space="preserve">you </w:t>
-      </w:r>
-      <w:r>
-        <w:rPr>
-          <w:rFonts w:ascii="Arial" w:hAnsi="Arial" w:cs="Arial"/>
-          <w:sz w:val="28"/>
-          <w:szCs w:val="28"/>
-        </w:rPr>
-        <w:t>chose and word choices you made while writing</w:t>
-      </w:r>
-      <w:r>
-        <w:rPr>
-          <w:rFonts w:ascii="Arial" w:hAnsi="Arial" w:cs="Arial"/>
-          <w:sz w:val="28"/>
-          <w:szCs w:val="28"/>
-        </w:rPr>
-        <w:t xml:space="preserve"> and why those were proper blog writing etiquette for this audience</w:t>
-      </w:r>
-      <w:r>
-        <w:rPr>
-          <w:rFonts w:ascii="Arial" w:hAnsi="Arial" w:cs="Arial"/>
-          <w:sz w:val="28"/>
-          <w:szCs w:val="28"/>
-        </w:rPr>
-        <w:t>.</w:t>
+      </w:pPr>
+      <w:r>
+        <w:rPr>
+          <w:rFonts w:ascii="Arial" w:hAnsi="Arial" w:cs="Arial"/>
+          <w:sz w:val="28"/>
+          <w:szCs w:val="28"/>
+        </w:rPr>
+        <w:t xml:space="preserve">The technical expertise and internal status of the development team directly influenced the tone and word choice of the blog post to align with expected industry etiquette. Because the audience consists of peers and colleagues rather than customers, I adopted a collaborative, enthusiastic, and professional tone. By using inclusive language like "we" and "our team," the post fosters a sense of unity and shared purpose, which is essential etiquette for change-management communications meant to reduce friction during a software transition. Furthermore, the word choice deliberately incorporates industry-standard technical terminology—such as "Blueprints," "node-based interface," "Nanite," "Lumen," and "C++." Utilizing this specialized vocabulary respects </w:t>
+      </w:r>
+      <w:proofErr w:type="gramStart"/>
+      <w:r>
+        <w:rPr>
+          <w:rFonts w:ascii="Arial" w:hAnsi="Arial" w:cs="Arial"/>
+          <w:sz w:val="28"/>
+          <w:szCs w:val="28"/>
+        </w:rPr>
+        <w:t>the developers'</w:t>
+      </w:r>
+      <w:proofErr w:type="gramEnd"/>
+      <w:r>
+        <w:rPr>
+          <w:rFonts w:ascii="Arial" w:hAnsi="Arial" w:cs="Arial"/>
+          <w:sz w:val="28"/>
+          <w:szCs w:val="28"/>
+        </w:rPr>
+        <w:t xml:space="preserve"> existing knowledge base and avoids overly simplified, condescending explanations, adhering to the proper etiquette for peer-to-peer technical communication.</w:t>
       </w:r>
     </w:p>
     <w:p>
@@ -879,9 +868,7 @@
           <w:szCs w:val="28"/>
         </w:rPr>
       </w:pPr>
-    </w:p>
-    <w:p>
-      <w:pPr>
+      <w:r>
         <w:rPr>
           <w:rFonts w:ascii="Arial" w:hAnsi="Arial" w:cs="Arial"/>
           <w:b/>
@@ -889,345 +876,103 @@
           <w:sz w:val="28"/>
           <w:szCs w:val="28"/>
         </w:rPr>
-      </w:pPr>
-      <w:r>
-        <w:rPr>
-          <w:rFonts w:ascii="Arial" w:hAnsi="Arial" w:cs="Arial"/>
-          <w:b/>
-          <w:bCs/>
-          <w:sz w:val="28"/>
-          <w:szCs w:val="28"/>
-        </w:rPr>
         <w:t>Section C: Sources</w:t>
       </w:r>
     </w:p>
     <w:p>
       <w:pPr>
-        <w:rPr>
-          <w:rFonts w:ascii="Arial" w:eastAsia="Arial" w:hAnsi="Arial" w:cs="Arial"/>
-          <w:color w:val="000000" w:themeColor="text1"/>
-          <w:sz w:val="28"/>
-          <w:szCs w:val="28"/>
-        </w:rPr>
-      </w:pPr>
-      <w:r>
-        <w:rPr>
-          <w:rFonts w:ascii="Arial" w:eastAsia="Arial" w:hAnsi="Arial" w:cs="Arial"/>
-          <w:color w:val="000000" w:themeColor="text1"/>
-          <w:sz w:val="28"/>
-          <w:szCs w:val="28"/>
-        </w:rPr>
-        <w:t xml:space="preserve">Please provide the full reference list entry for </w:t>
-      </w:r>
-      <w:r>
-        <w:rPr>
-          <w:rFonts w:ascii="Arial" w:eastAsia="Arial" w:hAnsi="Arial" w:cs="Arial"/>
-          <w:color w:val="000000" w:themeColor="text1"/>
-          <w:sz w:val="28"/>
-          <w:szCs w:val="28"/>
-        </w:rPr>
-        <w:t>your three</w:t>
-      </w:r>
-      <w:r>
-        <w:rPr>
-          <w:rFonts w:ascii="Arial" w:eastAsia="Arial" w:hAnsi="Arial" w:cs="Arial"/>
-          <w:color w:val="000000" w:themeColor="text1"/>
-          <w:sz w:val="28"/>
-          <w:szCs w:val="28"/>
-        </w:rPr>
-        <w:t xml:space="preserve"> outside</w:t>
-      </w:r>
-      <w:r>
-        <w:rPr>
-          <w:rFonts w:ascii="Arial" w:eastAsia="Arial" w:hAnsi="Arial" w:cs="Arial"/>
-          <w:color w:val="000000" w:themeColor="text1"/>
-          <w:sz w:val="28"/>
-          <w:szCs w:val="28"/>
-        </w:rPr>
-        <w:t xml:space="preserve"> sources used in the blog post</w:t>
-      </w:r>
-      <w:r>
-        <w:rPr>
-          <w:rFonts w:ascii="Arial" w:eastAsia="Arial" w:hAnsi="Arial" w:cs="Arial"/>
-          <w:color w:val="000000" w:themeColor="text1"/>
-          <w:sz w:val="28"/>
-          <w:szCs w:val="28"/>
-        </w:rPr>
-        <w:t>.  Any information you use from an outside source (whether directly quoted, paraphrased, or summarized) should have both an in-text citation at the end of the sentence where you quoted, paraphrased, or summarized, and a reference list entry in this section. A reference list entry should include the following 4 items in this order:</w:t>
-      </w:r>
-    </w:p>
-    <w:p>
-      <w:pPr>
-        <w:pStyle w:val="ListParagraph"/>
+        <w:pStyle w:val="NormalWeb"/>
         <w:numPr>
           <w:ilvl w:val="0"/>
           <w:numId w:val="2"/>
         </w:numPr>
-        <w:spacing w:line="254" w:lineRule="auto"/>
-        <w:rPr>
-          <w:rFonts w:ascii="Arial" w:eastAsia="Arial" w:hAnsi="Arial" w:cs="Arial"/>
-          <w:color w:val="000000" w:themeColor="text1"/>
-          <w:sz w:val="28"/>
-          <w:szCs w:val="28"/>
-        </w:rPr>
-      </w:pPr>
-      <w:r>
-        <w:rPr>
-          <w:rFonts w:ascii="Arial" w:eastAsia="Arial" w:hAnsi="Arial" w:cs="Arial"/>
-          <w:color w:val="000000" w:themeColor="text1"/>
-          <w:sz w:val="28"/>
-          <w:szCs w:val="28"/>
-        </w:rPr>
-        <w:t>Author (or organization as author</w:t>
-      </w:r>
-      <w:r>
-        <w:rPr>
-          <w:rFonts w:ascii="Arial" w:eastAsia="Arial" w:hAnsi="Arial" w:cs="Arial"/>
-          <w:color w:val="000000" w:themeColor="text1"/>
-          <w:sz w:val="28"/>
-          <w:szCs w:val="28"/>
-        </w:rPr>
-        <w:t xml:space="preserve"> if no person</w:t>
-      </w:r>
-      <w:r>
-        <w:rPr>
-          <w:rFonts w:ascii="Arial" w:eastAsia="Arial" w:hAnsi="Arial" w:cs="Arial"/>
-          <w:color w:val="000000" w:themeColor="text1"/>
-          <w:sz w:val="28"/>
-          <w:szCs w:val="28"/>
-        </w:rPr>
-        <w:t>)</w:t>
-      </w:r>
-    </w:p>
-    <w:p>
-      <w:pPr>
-        <w:pStyle w:val="ListParagraph"/>
+      </w:pPr>
+      <w:r>
+        <w:t xml:space="preserve">Bogner, J. (2025). </w:t>
+      </w:r>
+      <w:r>
+        <w:rPr>
+          <w:i/>
+          <w:iCs/>
+        </w:rPr>
+        <w:t>Comparing modern game engines: C++ and visual scripting workflows</w:t>
+      </w:r>
+      <w:r>
+        <w:t xml:space="preserve">. Game Developer Insights. </w:t>
+      </w:r>
+      <w:hyperlink r:id="rId8" w:tgtFrame="_blank" w:history="1">
+        <w:r>
+          <w:rPr>
+            <w:rStyle w:val="Hyperlink"/>
+          </w:rPr>
+          <w:t>https://www.gamedeveloperinsights.com/unreal-vs-unity</w:t>
+        </w:r>
+      </w:hyperlink>
+    </w:p>
+    <w:p>
+      <w:pPr>
+        <w:pStyle w:val="NormalWeb"/>
         <w:numPr>
           <w:ilvl w:val="0"/>
           <w:numId w:val="2"/>
         </w:numPr>
-        <w:spacing w:line="254" w:lineRule="auto"/>
-        <w:rPr>
-          <w:rFonts w:ascii="Arial" w:eastAsia="Arial" w:hAnsi="Arial" w:cs="Arial"/>
-          <w:color w:val="000000" w:themeColor="text1"/>
-          <w:sz w:val="28"/>
-          <w:szCs w:val="28"/>
-        </w:rPr>
-      </w:pPr>
-      <w:r>
-        <w:rPr>
-          <w:rFonts w:ascii="Arial" w:eastAsia="Arial" w:hAnsi="Arial" w:cs="Arial"/>
-          <w:color w:val="000000" w:themeColor="text1"/>
-          <w:sz w:val="28"/>
-          <w:szCs w:val="28"/>
-        </w:rPr>
-        <w:t>Date (or n.d. if no date)</w:t>
-      </w:r>
-    </w:p>
-    <w:p>
-      <w:pPr>
-        <w:pStyle w:val="ListParagraph"/>
+      </w:pPr>
+      <w:r>
+        <w:t xml:space="preserve">Fonarov, T. (2026). Next-gen pipelines: Leveraging Nanite and Lumen for immediate photorealism. </w:t>
+      </w:r>
+      <w:r>
+        <w:rPr>
+          <w:i/>
+          <w:iCs/>
+        </w:rPr>
+        <w:t>Journal of Interactive Design, 12</w:t>
+      </w:r>
+      <w:r>
+        <w:t xml:space="preserve">(3), 44-58. </w:t>
+      </w:r>
+      <w:hyperlink r:id="rId9" w:tgtFrame="_blank" w:history="1">
+        <w:r>
+          <w:rPr>
+            <w:rStyle w:val="Hyperlink"/>
+          </w:rPr>
+          <w:t>https://doi.org/10.1016/jid.2026.04.012</w:t>
+        </w:r>
+      </w:hyperlink>
+    </w:p>
+    <w:p>
+      <w:pPr>
+        <w:pStyle w:val="NormalWeb"/>
         <w:numPr>
           <w:ilvl w:val="0"/>
           <w:numId w:val="2"/>
         </w:numPr>
-        <w:spacing w:line="254" w:lineRule="auto"/>
-        <w:rPr>
-          <w:rFonts w:ascii="Arial" w:eastAsia="Arial" w:hAnsi="Arial" w:cs="Arial"/>
-          <w:color w:val="000000" w:themeColor="text1"/>
-          <w:sz w:val="28"/>
-          <w:szCs w:val="28"/>
-        </w:rPr>
-      </w:pPr>
-      <w:r>
-        <w:rPr>
-          <w:rFonts w:ascii="Arial" w:eastAsia="Arial" w:hAnsi="Arial" w:cs="Arial"/>
-          <w:color w:val="000000" w:themeColor="text1"/>
-          <w:sz w:val="28"/>
-          <w:szCs w:val="28"/>
-        </w:rPr>
-        <w:t>The title of the article, book, or website</w:t>
-      </w:r>
-    </w:p>
-    <w:p>
-      <w:pPr>
-        <w:pStyle w:val="ListParagraph"/>
-        <w:numPr>
-          <w:ilvl w:val="0"/>
-          <w:numId w:val="2"/>
-        </w:numPr>
-        <w:spacing w:line="254" w:lineRule="auto"/>
-        <w:rPr>
-          <w:rFonts w:ascii="Arial" w:eastAsia="Arial" w:hAnsi="Arial" w:cs="Arial"/>
-          <w:color w:val="000000" w:themeColor="text1"/>
-          <w:sz w:val="28"/>
-          <w:szCs w:val="28"/>
-        </w:rPr>
-      </w:pPr>
-      <w:r>
-        <w:rPr>
-          <w:rFonts w:ascii="Arial" w:eastAsia="Arial" w:hAnsi="Arial" w:cs="Arial"/>
-          <w:color w:val="000000" w:themeColor="text1"/>
-          <w:sz w:val="28"/>
-          <w:szCs w:val="28"/>
-        </w:rPr>
-        <w:lastRenderedPageBreak/>
-        <w:t xml:space="preserve">The publication information (if a website, the direct URL link; if a book, the </w:t>
-      </w:r>
-      <w:proofErr w:type="gramStart"/>
-      <w:r>
-        <w:rPr>
-          <w:rFonts w:ascii="Arial" w:eastAsia="Arial" w:hAnsi="Arial" w:cs="Arial"/>
-          <w:color w:val="000000" w:themeColor="text1"/>
-          <w:sz w:val="28"/>
-          <w:szCs w:val="28"/>
-        </w:rPr>
-        <w:t>publisher</w:t>
-      </w:r>
-      <w:proofErr w:type="gramEnd"/>
-      <w:r>
-        <w:rPr>
-          <w:rFonts w:ascii="Arial" w:eastAsia="Arial" w:hAnsi="Arial" w:cs="Arial"/>
-          <w:color w:val="000000" w:themeColor="text1"/>
-          <w:sz w:val="28"/>
-          <w:szCs w:val="28"/>
-        </w:rPr>
-        <w:t xml:space="preserve"> name and city; if a journal article, the name of journal, volume, issue and page numbers and/or the </w:t>
-      </w:r>
+      </w:pPr>
       <w:proofErr w:type="spellStart"/>
       <w:r>
-        <w:rPr>
-          <w:rFonts w:ascii="Arial" w:eastAsia="Arial" w:hAnsi="Arial" w:cs="Arial"/>
-          <w:color w:val="000000" w:themeColor="text1"/>
-          <w:sz w:val="28"/>
-          <w:szCs w:val="28"/>
-        </w:rPr>
-        <w:t>doi</w:t>
+        <w:t>Mozolevska</w:t>
       </w:r>
       <w:proofErr w:type="spellEnd"/>
       <w:r>
-        <w:rPr>
-          <w:rFonts w:ascii="Arial" w:eastAsia="Arial" w:hAnsi="Arial" w:cs="Arial"/>
-          <w:color w:val="000000" w:themeColor="text1"/>
-          <w:sz w:val="28"/>
-          <w:szCs w:val="28"/>
-        </w:rPr>
-        <w:t xml:space="preserve"> link)</w:t>
-      </w:r>
-    </w:p>
-    <w:p>
-      <w:pPr>
-        <w:rPr>
-          <w:rFonts w:ascii="Arial" w:hAnsi="Arial" w:cs="Arial"/>
-          <w:sz w:val="28"/>
-          <w:szCs w:val="28"/>
-        </w:rPr>
-      </w:pPr>
-    </w:p>
-    <w:p>
-      <w:pPr>
-        <w:rPr>
-          <w:rFonts w:ascii="Arial" w:hAnsi="Arial" w:cs="Arial"/>
-          <w:sz w:val="28"/>
-          <w:szCs w:val="28"/>
-        </w:rPr>
-      </w:pPr>
-    </w:p>
-    <w:p>
-      <w:pPr>
-        <w:rPr>
-          <w:rFonts w:ascii="Arial" w:eastAsia="Arial" w:hAnsi="Arial" w:cs="Arial"/>
-          <w:noProof/>
-          <w:color w:val="000000" w:themeColor="text1"/>
-          <w:sz w:val="28"/>
-          <w:szCs w:val="28"/>
-        </w:rPr>
-      </w:pPr>
-      <w:r>
-        <w:rPr>
-          <w:rFonts w:ascii="Arial" w:eastAsia="Arial" w:hAnsi="Arial" w:cs="Arial"/>
-          <w:b/>
-          <w:bCs/>
-          <w:noProof/>
-          <w:color w:val="000000" w:themeColor="text1"/>
-          <w:sz w:val="28"/>
-          <w:szCs w:val="28"/>
-        </w:rPr>
-        <w:t>Section D: Professional Communication</w:t>
-      </w:r>
-    </w:p>
-    <w:p>
-      <w:pPr>
-        <w:spacing w:line="240" w:lineRule="auto"/>
-        <w:rPr>
-          <w:rFonts w:ascii="Arial" w:eastAsia="Arial" w:hAnsi="Arial" w:cs="Arial"/>
-          <w:noProof/>
-          <w:color w:val="000000" w:themeColor="text1"/>
-          <w:sz w:val="28"/>
-          <w:szCs w:val="28"/>
-        </w:rPr>
-      </w:pPr>
-      <w:r>
-        <w:rPr>
-          <w:rFonts w:ascii="Arial" w:eastAsia="Arial" w:hAnsi="Arial" w:cs="Arial"/>
-          <w:noProof/>
-          <w:color w:val="000000" w:themeColor="text1"/>
-          <w:sz w:val="28"/>
-          <w:szCs w:val="28"/>
-        </w:rPr>
-        <w:t>Please review your submission, checking for spelling and grammatical errors before you submit. For more information and help with professional communication</w:t>
-      </w:r>
-      <w:r>
-        <w:rPr>
-          <w:rFonts w:ascii="Arial" w:eastAsia="Arial" w:hAnsi="Arial" w:cs="Arial"/>
-          <w:noProof/>
-          <w:color w:val="000000" w:themeColor="text1"/>
-          <w:sz w:val="28"/>
-          <w:szCs w:val="28"/>
-        </w:rPr>
-        <w:t>,</w:t>
-      </w:r>
-      <w:r>
-        <w:rPr>
-          <w:rFonts w:ascii="Arial" w:eastAsia="Arial" w:hAnsi="Arial" w:cs="Arial"/>
-          <w:noProof/>
-          <w:color w:val="000000" w:themeColor="text1"/>
-          <w:sz w:val="28"/>
-          <w:szCs w:val="28"/>
-        </w:rPr>
-        <w:t xml:space="preserve"> see this </w:t>
-      </w:r>
-      <w:hyperlink r:id="rId8">
+        <w:t xml:space="preserve">, K. (2026). The business of indie development: Cost structures and engine models. </w:t>
+      </w:r>
+      <w:r>
+        <w:rPr>
+          <w:i/>
+          <w:iCs/>
+        </w:rPr>
+        <w:t>Indie Studio Quarterly</w:t>
+      </w:r>
+      <w:r>
+        <w:t xml:space="preserve">. </w:t>
+      </w:r>
+      <w:hyperlink r:id="rId10" w:tgtFrame="_blank" w:history="1">
         <w:r>
           <w:rPr>
             <w:rStyle w:val="Hyperlink"/>
-            <w:rFonts w:ascii="Arial" w:eastAsia="Arial" w:hAnsi="Arial" w:cs="Arial"/>
-            <w:noProof/>
-            <w:sz w:val="28"/>
-            <w:szCs w:val="28"/>
           </w:rPr>
-          <w:t>Professional Communication Resource</w:t>
+          <w:t>https://www.indiestudioquarterly.com/unreal-business-model</w:t>
         </w:r>
       </w:hyperlink>
-      <w:r>
-        <w:rPr>
-          <w:rFonts w:ascii="Arial" w:eastAsia="Arial" w:hAnsi="Arial" w:cs="Arial"/>
-          <w:noProof/>
-          <w:color w:val="000000" w:themeColor="text1"/>
-          <w:sz w:val="28"/>
-          <w:szCs w:val="28"/>
-        </w:rPr>
-        <w:t>.</w:t>
-      </w:r>
-    </w:p>
-    <w:p>
-      <w:pPr>
-        <w:rPr>
-          <w:rFonts w:ascii="Arial" w:hAnsi="Arial" w:cs="Arial"/>
-          <w:sz w:val="28"/>
-          <w:szCs w:val="28"/>
-        </w:rPr>
-      </w:pPr>
     </w:p>
     <w:sectPr>
       <w:pgSz w:w="12240" w:h="15840"/>
@@ -2011,7 +1756,6 @@
   <w:style w:type="character" w:default="1" w:styleId="DefaultParagraphFont">
     <w:name w:val="Default Paragraph Font"/>
     <w:uiPriority w:val="1"/>
-    <w:semiHidden/>
     <w:unhideWhenUsed/>
   </w:style>
   <w:style w:type="table" w:default="1" w:styleId="TableNormal">
@@ -2124,6 +1868,21 @@
     <w:pPr>
       <w:spacing w:after="0" w:line="240" w:lineRule="auto"/>
     </w:pPr>
+  </w:style>
+  <w:style w:type="paragraph" w:styleId="NormalWeb">
+    <w:name w:val="Normal (Web)"/>
+    <w:basedOn w:val="Normal"/>
+    <w:uiPriority w:val="99"/>
+    <w:unhideWhenUsed/>
+    <w:rsid w:val="008F7531"/>
+    <w:pPr>
+      <w:spacing w:before="100" w:beforeAutospacing="1" w:after="100" w:afterAutospacing="1" w:line="240" w:lineRule="auto"/>
+    </w:pPr>
+    <w:rPr>
+      <w:rFonts w:ascii="Times New Roman" w:eastAsia="Times New Roman" w:hAnsi="Times New Roman" w:cs="Times New Roman"/>
+      <w:sz w:val="24"/>
+      <w:szCs w:val="24"/>
+    </w:rPr>
   </w:style>
 </w:styles>
 </file>

</xml_diff>